<commit_message>
Default to local-save mode; add UPLOAD_TO_DROPBOX flag and update docs
Co-authored-by: Copilot <223556219+Copilot@users.noreply.github.com>
</commit_message>
<xml_diff>
--- a/HSBC_script_documentation.docx
+++ b/HSBC_script_documentation.docx
@@ -32,7 +32,7 @@
     </w:p>
     <w:p>
       <w:r>
-        <w:t>1. Purpose: find Gmail messages from HSBC with subject "Your Monthly HSBC Bank Statement", extract PDF attachments, skip duplicates, save locally (to your Dropbox-sync folder) or upload to Dropbox if a token is provided, mark emails read and move them into a "HomeLoans" label/folder, and keep a checkpoint so older messages aren't reprocessed.</w:t>
+        <w:t>1. Purpose: find Gmail messages from HSBC with subject "Your Monthly HSBC Bank Statement", extract PDF attachments, skip duplicates, save locally (to your Dropbox-sync folder) by default, or upload to Dropbox only when explicitly enabled and correctly scoped.</w:t>
       </w:r>
     </w:p>
     <w:p>
@@ -50,6 +50,8 @@
         <w:br/>
         <w:t xml:space="preserve">   - Inline comments added throughout the file for maintainability</w:t>
         <w:br/>
+        <w:t xml:space="preserve">   - Introduction of UPLOAD_TO_DROPBOX env flag (defaults to false). By default the script uses LOCAL_DEST_FOLDER and does not upload.</w:t>
+        <w:br/>
         <w:t xml:space="preserve">   - State file has two keys: last_processed_date (ISO timestamp) and processed_hashes (list of sha256 hex digests)</w:t>
       </w:r>
     </w:p>
@@ -61,9 +63,13 @@
         <w:br/>
         <w:t xml:space="preserve">  - Prepare .env in repo root with your credentials (do NOT commit it)</w:t>
         <w:br/>
-        <w:t xml:space="preserve">  - Run preview: python email_attachments_to_dropbox.py --dry-run</w:t>
+        <w:t xml:space="preserve">  - Ensure LOCAL_DEST_FOLDER is set to a Dropbox-synced local path where attachments should be saved</w:t>
         <w:br/>
-        <w:t xml:space="preserve">  - Run live: python email_attachments_to_dropbox.py</w:t>
+        <w:t xml:space="preserve">  - By default: Run preview: python email_attachments_to_dropbox.py --dry-run (will not save/move)</w:t>
+        <w:br/>
+        <w:t xml:space="preserve">  - Live local-save: python email_attachments_to_dropbox.py (saves files into LOCAL_DEST_FOLDER)</w:t>
+        <w:br/>
+        <w:t xml:space="preserve">  - To enable Dropbox uploads: set UPLOAD_TO_DROPBOX=true and provide a DROPBOX_ACCESS_TOKEN with appropriate scopes (files.content.write). Prefer using Full Dropbox scope if you want uploads outside the App sandbox</w:t>
       </w:r>
     </w:p>
     <w:p>
@@ -75,6 +81,8 @@
         <w:t xml:space="preserve">  - IMAP label handling varies; if automatic label creation fails, create the "HomeLoans" label manually in Gmail</w:t>
         <w:br/>
         <w:t xml:space="preserve">  - The script stores processed hashes and last processed date in processed_statements.json in the repo root; keep this file private</w:t>
+        <w:br/>
+        <w:t xml:space="preserve">  - By default uploads are disabled to avoid unexpected App-folder sandboxing. If you enable uploads, confirm the Dropbox app permission model and token scopes before running live</w:t>
       </w:r>
     </w:p>
     <w:p/>

</xml_diff>